<commit_message>
Remove all "game" framing — full Digital Twin pivot
- Default --engine 'unity' → 'omniverse' (config.py)
- Docstrings / labels / CLI help: game-ready → DT-ready
- Region-split mode reframed as LOD/modular, not game/LOD
- Color clean strength options no longer mention game LOD
- report.py next-step suggests Omniverse/Twinmotion/BIM import
- pipeline.py + export.py: engine choices keep legacy realtime
  axis conversion but DT engines are listed first
- Regenerated CleanMesh_기술문서.docx + CleanMesh_매뉴얼.pptx
</commit_message>
<xml_diff>
--- a/CleanMesh_기술문서.docx
+++ b/CleanMesh_기술문서.docx
@@ -146,7 +146,7 @@
                 <w:rFonts w:ascii="맑은 고딕" w:hAnsi="맑은 고딕" w:eastAsia="맑은 고딕"/>
                 <w:sz w:val="18"/>
               </w:rPr>
-              <w:t>2026-06-23</w:t>
+              <w:t>2026-06-24</w:t>
             </w:r>
           </w:p>
         </w:tc>
@@ -337,7 +337,7 @@
           <w:b w:val="0"/>
           <w:sz w:val="20"/>
         </w:rPr>
-        <w:t>CleanMesh Studio는 실제 산업 현장의 사진을 디지털 트윈 플랫폼(NVIDIA Omniverse, Twinmotion, Unreal/Unity 기반 DT, BIM 협업툴 등)에 임포트 가능한 정확도-우선 3D 자산으로 변환하는 엔드투엔드 파이프라인입니다. AGV·팔레트·드럼·컨베이어·선반 같은 현장 설비를 한 장의 사진과 마우스 클릭 한 번으로 디지털 트윈에 즉시 배치 가능한 GLB / USD 자산으로 만듭니다.</w:t>
+        <w:t>CleanMesh Studio는 실제 산업 현장의 사진을 디지털 트윈 플랫폼(NVIDIA Omniverse, Twinmotion, BIM 협업툴, Pixar USD 기반 뷰어 등)에 임포트 가능한 정확도-우선 3D 자산으로 변환하는 엔드투엔드 파이프라인입니다. AGV·팔레트·드럼·컨베이어·선반 같은 현장 설비를 한 장의 사진과 마우스 클릭 한 번으로 디지털 트윈에 즉시 배치 가능한 GLB / USD 자산으로 만듭니다.</w:t>
       </w:r>
     </w:p>
     <w:p>
@@ -415,7 +415,7 @@
           <w:rFonts w:ascii="맑은 고딕" w:hAnsi="맑은 고딕" w:eastAsia="맑은 고딕"/>
           <w:sz w:val="20"/>
         </w:rPr>
-        <w:t>GLB / USD / FBX 멀티 익스포트 — Omniverse, Twinmotion, Unreal 호환</w:t>
+        <w:t>GLB / USD / FBX 멀티 익스포트 — Omniverse · Twinmotion · BIM 협업툴 호환</w:t>
       </w:r>
     </w:p>
     <w:p>
@@ -532,7 +532,7 @@
           <w:rFonts w:ascii="맑은 고딕" w:hAnsi="맑은 고딕" w:eastAsia="맑은 고딕"/>
           <w:sz w:val="20"/>
         </w:rPr>
-        <w:t>색상 모드 2종: 정점 색상(DT 권장) / 영역별 분해 (게임/LOD 용)</w:t>
+        <w:t>색상 모드 2종: 정점 색상 (DT 권장, 실표면 보존) / 영역별 분해 (자산 모듈화 용)</w:t>
       </w:r>
     </w:p>
     <w:p>
@@ -3931,7 +3931,7 @@
                 <w:rFonts w:ascii="맑은 고딕" w:hAnsi="맑은 고딕" w:eastAsia="맑은 고딕"/>
                 <w:sz w:val="18"/>
               </w:rPr>
-              <w:t>게임 LOD / 머티리얼 교체</w:t>
+              <w:t>자산 모듈화 / 부품별 머티리얼 교체 / LOD</w:t>
             </w:r>
           </w:p>
         </w:tc>
@@ -7037,7 +7037,17 @@
           <w:color w:val="2E74B5"/>
           <w:sz w:val="28"/>
         </w:rPr>
-        <w:t>9.2 게임용 vs 디지털 트윈 옵션 비교</w:t>
+        <w:t>9.2 디지털 트윈 권장 옵션 표</w:t>
+      </w:r>
+    </w:p>
+    <w:p>
+      <w:r>
+        <w:rPr>
+          <w:rFonts w:ascii="맑은 고딕" w:hAnsi="맑은 고딕" w:eastAsia="맑은 고딕"/>
+          <w:b w:val="0"/>
+          <w:sz w:val="20"/>
+        </w:rPr>
+        <w:t>정확성·진단가치·재현성을 우선하는 디지털 트윈 기본 설정:</w:t>
       </w:r>
     </w:p>
     <w:tbl>
@@ -7067,7 +7077,7 @@
                 <w:color w:val="FFFFFF"/>
                 <w:sz w:val="20"/>
               </w:rPr>
-              <w:t>설정</w:t>
+              <w:t>항목</w:t>
             </w:r>
           </w:p>
         </w:tc>
@@ -7085,7 +7095,7 @@
                 <w:color w:val="FFFFFF"/>
                 <w:sz w:val="20"/>
               </w:rPr>
-              <w:t>게임</w:t>
+              <w:t>권장 값</w:t>
             </w:r>
           </w:p>
         </w:tc>
@@ -7103,7 +7113,7 @@
                 <w:color w:val="FFFFFF"/>
                 <w:sz w:val="20"/>
               </w:rPr>
-              <w:t>디지털 트윈 (권장)</w:t>
+              <w:t>이유</w:t>
             </w:r>
           </w:p>
         </w:tc>
@@ -7135,7 +7145,7 @@
                 <w:rFonts w:ascii="맑은 고딕" w:hAnsi="맑은 고딕" w:eastAsia="맑은 고딕"/>
                 <w:sz w:val="18"/>
               </w:rPr>
-              <w:t>speed (TripoSR)</w:t>
+              <w:t>quality (TRELLIS Single)</w:t>
             </w:r>
           </w:p>
         </w:tc>
@@ -7150,7 +7160,7 @@
                 <w:rFonts w:ascii="맑은 고딕" w:hAnsi="맑은 고딕" w:eastAsia="맑은 고딕"/>
                 <w:sz w:val="18"/>
               </w:rPr>
-              <w:t>quality (TRELLIS Single)</w:t>
+              <w:t>DINOv2 feature + 24 step diffusion 으로 디테일 보존</w:t>
             </w:r>
           </w:p>
         </w:tc>
@@ -7182,7 +7192,7 @@
                 <w:rFonts w:ascii="맑은 고딕" w:hAnsi="맑은 고딕" w:eastAsia="맑은 고딕"/>
                 <w:sz w:val="18"/>
               </w:rPr>
-              <w:t>region_split (K=3~5)</w:t>
+              <w:t>vertex (정점 색상)</w:t>
             </w:r>
           </w:p>
         </w:tc>
@@ -7197,7 +7207,7 @@
                 <w:rFonts w:ascii="맑은 고딕" w:hAnsi="맑은 고딕" w:eastAsia="맑은 고딕"/>
                 <w:sz w:val="18"/>
               </w:rPr>
-              <w:t>vertex (그라데이션 보존)</w:t>
+              <w:t>실제 표면 외관(산화·녹·라벨) 그대로 보존 → 자산 식별 가치</w:t>
             </w:r>
           </w:p>
         </w:tc>
@@ -7229,7 +7239,7 @@
                 <w:rFonts w:ascii="맑은 고딕" w:hAnsi="맑은 고딕" w:eastAsia="맑은 고딕"/>
                 <w:sz w:val="18"/>
               </w:rPr>
-              <w:t>강</w:t>
+              <w:t>약 (light, 기본값)</w:t>
             </w:r>
           </w:p>
         </w:tc>
@@ -7244,7 +7254,7 @@
                 <w:rFonts w:ascii="맑은 고딕" w:hAnsi="맑은 고딕" w:eastAsia="맑은 고딕"/>
                 <w:sz w:val="18"/>
               </w:rPr>
-              <w:t>약 또는 끄기</w:t>
+              <w:t>Laplacian 2회만 — 디퓨전 노이즈는 제거하되 디테일은 유지</w:t>
             </w:r>
           </w:p>
         </w:tc>
@@ -7276,7 +7286,7 @@
                 <w:rFonts w:ascii="맑은 고딕" w:hAnsi="맑은 고딕" w:eastAsia="맑은 고딕"/>
                 <w:sz w:val="18"/>
               </w:rPr>
-              <w:t>5,000~20,000 (LOD)</w:t>
+              <w:t>None (보존)</w:t>
             </w:r>
           </w:p>
         </w:tc>
@@ -7291,7 +7301,7 @@
                 <w:rFonts w:ascii="맑은 고딕" w:hAnsi="맑은 고딕" w:eastAsia="맑은 고딕"/>
                 <w:sz w:val="18"/>
               </w:rPr>
-              <w:t>None (보존)</w:t>
+              <w:t>감산(decimate) 없이 원본 정점 그대로 → 정확성 우선</w:t>
             </w:r>
           </w:p>
         </w:tc>
@@ -7308,7 +7318,7 @@
                 <w:rFonts w:ascii="맑은 고딕" w:hAnsi="맑은 고딕" w:eastAsia="맑은 고딕"/>
                 <w:sz w:val="18"/>
               </w:rPr>
-              <w:t>익스포트</w:t>
+              <w:t>익스포트 포맷</w:t>
             </w:r>
           </w:p>
         </w:tc>
@@ -7323,7 +7333,7 @@
                 <w:rFonts w:ascii="맑은 고딕" w:hAnsi="맑은 고딕" w:eastAsia="맑은 고딕"/>
                 <w:sz w:val="18"/>
               </w:rPr>
-              <w:t>GLB / FBX</w:t>
+              <w:t>USD (Omniverse) 또는 GLB</w:t>
             </w:r>
           </w:p>
         </w:tc>
@@ -7338,7 +7348,7 @@
                 <w:rFonts w:ascii="맑은 고딕" w:hAnsi="맑은 고딕" w:eastAsia="맑은 고딕"/>
                 <w:sz w:val="18"/>
               </w:rPr>
-              <w:t>USD + GLB (메타 포함)</w:t>
+              <w:t>USD: customLayerData 임베드 / GLB: extras 임베드</w:t>
             </w:r>
           </w:p>
         </w:tc>
@@ -7370,7 +7380,7 @@
                 <w:rFonts w:ascii="맑은 고딕" w:hAnsi="맑은 고딕" w:eastAsia="맑은 고딕"/>
                 <w:sz w:val="18"/>
               </w:rPr>
-              <w:t>객체 이름</w:t>
+              <w:t>카테고리·실치수·제조사·시리얼</w:t>
             </w:r>
           </w:p>
         </w:tc>
@@ -7385,7 +7395,7 @@
                 <w:rFonts w:ascii="맑은 고딕" w:hAnsi="맑은 고딕" w:eastAsia="맑은 고딕"/>
                 <w:sz w:val="18"/>
               </w:rPr>
-              <w:t>치수·제조사·시리얼·카테고리</w:t>
+              <w:t>DT 플랫폼에서 자산 검색·필터링·진단에 사용</w:t>
             </w:r>
           </w:p>
         </w:tc>
@@ -7402,7 +7412,7 @@
                 <w:rFonts w:ascii="맑은 고딕" w:hAnsi="맑은 고딕" w:eastAsia="맑은 고딕"/>
                 <w:sz w:val="18"/>
               </w:rPr>
-              <w:t>적용 분야</w:t>
+              <w:t>엔진 옵션</w:t>
             </w:r>
           </w:p>
         </w:tc>
@@ -7417,7 +7427,7 @@
                 <w:rFonts w:ascii="맑은 고딕" w:hAnsi="맑은 고딕" w:eastAsia="맑은 고딕"/>
                 <w:sz w:val="18"/>
               </w:rPr>
-              <w:t>Unity·Unreal·Godot</w:t>
+              <w:t>omniverse / twinmotion / bim</w:t>
             </w:r>
           </w:p>
         </w:tc>
@@ -7432,7 +7442,54 @@
                 <w:rFonts w:ascii="맑은 고딕" w:hAnsi="맑은 고딕" w:eastAsia="맑은 고딕"/>
                 <w:sz w:val="18"/>
               </w:rPr>
-              <w:t>Omniverse·Twinmotion·Unreal DT·BIM</w:t>
+              <w:t>실세계 단위(meter) 보존, Z-up USD 컨벤션</w:t>
+            </w:r>
+          </w:p>
+        </w:tc>
+      </w:tr>
+      <w:tr>
+        <w:tc>
+          <w:tcPr>
+            <w:tcW w:type="dxa" w:w="2880"/>
+          </w:tcPr>
+          <w:p>
+            <w:r/>
+            <w:r>
+              <w:rPr>
+                <w:rFonts w:ascii="맑은 고딕" w:hAnsi="맑은 고딕" w:eastAsia="맑은 고딕"/>
+                <w:sz w:val="18"/>
+              </w:rPr>
+              <w:t>Deterministic</w:t>
+            </w:r>
+          </w:p>
+        </w:tc>
+        <w:tc>
+          <w:tcPr>
+            <w:tcW w:type="dxa" w:w="2880"/>
+          </w:tcPr>
+          <w:p>
+            <w:r/>
+            <w:r>
+              <w:rPr>
+                <w:rFonts w:ascii="맑은 고딕" w:hAnsi="맑은 고딕" w:eastAsia="맑은 고딕"/>
+                <w:sz w:val="18"/>
+              </w:rPr>
+              <w:t>16GB+ GPU 시 ON</w:t>
+            </w:r>
+          </w:p>
+        </w:tc>
+        <w:tc>
+          <w:tcPr>
+            <w:tcW w:type="dxa" w:w="2880"/>
+          </w:tcPr>
+          <w:p>
+            <w:r/>
+            <w:r>
+              <w:rPr>
+                <w:rFonts w:ascii="맑은 고딕" w:hAnsi="맑은 고딕" w:eastAsia="맑은 고딕"/>
+                <w:sz w:val="18"/>
+              </w:rPr>
+              <w:t>같은 사진 → 같은 모델 → 자산 버전 관리·diff 가능</w:t>
             </w:r>
           </w:p>
         </w:tc>
@@ -8709,7 +8766,7 @@
           <w:b w:val="0"/>
           <w:sz w:val="20"/>
         </w:rPr>
-        <w:t>버전 1.1 · 2026-06-23 00:27</w:t>
+        <w:t>버전 1.1 · 2026-06-24 22:54</w:t>
       </w:r>
     </w:p>
     <w:p>

</xml_diff>